<commit_message>
Documento de declaración de uso de IA
</commit_message>
<xml_diff>
--- a/Docs/Segunda semana/word/Registro_de_supuestos_v1.1_2026-10-04.docx
+++ b/Docs/Segunda semana/word/Registro_de_supuestos_v1.1_2026-10-04.docx
@@ -1565,7 +1565,25 @@
               <w:rPr>
                 <w:sz w:val="16"/>
               </w:rPr>
-              <w:t>21/10/2026-09/03/2027</w:t>
+              <w:t>06</w:t>
+            </w:r>
+            <w:r>
+              <w:rPr>
+                <w:sz w:val="16"/>
+              </w:rPr>
+              <w:t>/1</w:t>
+            </w:r>
+            <w:r>
+              <w:rPr>
+                <w:sz w:val="16"/>
+              </w:rPr>
+              <w:t>1</w:t>
+            </w:r>
+            <w:r>
+              <w:rPr>
+                <w:sz w:val="16"/>
+              </w:rPr>
+              <w:t>/2026-09/03/2027</w:t>
             </w:r>
           </w:p>
         </w:tc>
@@ -2620,14 +2638,7 @@
               <w:color w:val="595959"/>
               <w:sz w:val="16"/>
             </w:rPr>
-            <w:t xml:space="preserve">Registro </w:t>
-          </w:r>
-          <w:r>
-            <w:rPr>
-              <w:color w:val="595959"/>
-              <w:sz w:val="16"/>
-            </w:rPr>
-            <w:t xml:space="preserve">de supuestos · Página </w:t>
+            <w:t xml:space="preserve">Registro de supuestos · Página </w:t>
           </w:r>
           <w:r>
             <w:rPr>

</xml_diff>